<commit_message>
docs: README.md como índice navegable de toda la documentación
- docs/README.md: índice con enlaces a los 8 documentos canónicos,
  organizados por audiencia (usuario final, desarrollador, auditoría,
  histórico, deploy)
- Incluye stack y costes orientativos para terceros que quieran
  replicar el deploy
- Tag de respaldo recomendado para rollback rápido

.gitignore: añadido ~$* para que los lock files de Word/Excel no
queden tracked

Co-Authored-By: Claude Opus 4.7 <noreply@anthropic.com>
</commit_message>
<xml_diff>
--- a/docs/actualización proyecto monetav2.docx
+++ b/docs/actualización proyecto monetav2.docx
@@ -7,6 +7,9 @@
         <w:t>actualización proyecto moneta</w:t>
       </w:r>
       <w:r>
+        <w:rPr>
+          <w:noProof/>
+        </w:rPr>
         <w:drawing>
           <wp:inline distT="0" distB="0" distL="0" distR="0" wp14:anchorId="07BD0ACD" wp14:editId="7CC36B8E">
             <wp:extent cx="6489592" cy="2590800"/>
@@ -44,6 +47,9 @@
         </w:drawing>
       </w:r>
       <w:r>
+        <w:rPr>
+          <w:noProof/>
+        </w:rPr>
         <w:drawing>
           <wp:inline distT="0" distB="0" distL="0" distR="0" wp14:anchorId="74657E2B" wp14:editId="064C1A41">
             <wp:extent cx="6515100" cy="2245783"/>
@@ -81,6 +87,9 @@
         </w:drawing>
       </w:r>
       <w:r>
+        <w:rPr>
+          <w:noProof/>
+        </w:rPr>
         <w:drawing>
           <wp:inline distT="0" distB="0" distL="0" distR="0" wp14:anchorId="48153551" wp14:editId="118E4328">
             <wp:extent cx="6516674" cy="1143000"/>
@@ -118,6 +127,9 @@
         </w:drawing>
       </w:r>
       <w:r>
+        <w:rPr>
+          <w:noProof/>
+        </w:rPr>
         <w:lastRenderedPageBreak/>
         <w:drawing>
           <wp:inline distT="0" distB="0" distL="0" distR="0" wp14:anchorId="08EBFAC1" wp14:editId="65A8A3DB">
@@ -156,6 +168,9 @@
         </w:drawing>
       </w:r>
       <w:r>
+        <w:rPr>
+          <w:noProof/>
+        </w:rPr>
         <w:drawing>
           <wp:inline distT="0" distB="0" distL="0" distR="0" wp14:anchorId="14CCF4BC" wp14:editId="1FC42A80">
             <wp:extent cx="6516370" cy="2842568"/>
@@ -193,6 +208,9 @@
         </w:drawing>
       </w:r>
       <w:r>
+        <w:rPr>
+          <w:noProof/>
+        </w:rPr>
         <w:drawing>
           <wp:inline distT="0" distB="0" distL="0" distR="0" wp14:anchorId="12A3F8D5" wp14:editId="5D484960">
             <wp:extent cx="6534150" cy="1874748"/>
@@ -230,6 +248,9 @@
         </w:drawing>
       </w:r>
       <w:r>
+        <w:rPr>
+          <w:noProof/>
+        </w:rPr>
         <w:lastRenderedPageBreak/>
         <w:drawing>
           <wp:inline distT="0" distB="0" distL="0" distR="0" wp14:anchorId="182DA018" wp14:editId="59D693C5">
@@ -268,6 +289,9 @@
         </w:drawing>
       </w:r>
       <w:r>
+        <w:rPr>
+          <w:noProof/>
+        </w:rPr>
         <w:drawing>
           <wp:inline distT="0" distB="0" distL="0" distR="0" wp14:anchorId="22C5B14C" wp14:editId="07F4FC08">
             <wp:extent cx="6553200" cy="1958741"/>
@@ -305,6 +329,9 @@
         </w:drawing>
       </w:r>
       <w:r>
+        <w:rPr>
+          <w:noProof/>
+        </w:rPr>
         <w:drawing>
           <wp:inline distT="0" distB="0" distL="0" distR="0" wp14:anchorId="38B3E530" wp14:editId="7F7A775F">
             <wp:extent cx="6570980" cy="1382395"/>
@@ -342,6 +369,9 @@
         </w:drawing>
       </w:r>
       <w:r>
+        <w:rPr>
+          <w:noProof/>
+        </w:rPr>
         <w:lastRenderedPageBreak/>
         <w:drawing>
           <wp:inline distT="0" distB="0" distL="0" distR="0" wp14:anchorId="21D0EDED" wp14:editId="584E7CC4">
@@ -380,6 +410,9 @@
         </w:drawing>
       </w:r>
       <w:r>
+        <w:rPr>
+          <w:noProof/>
+        </w:rPr>
         <w:drawing>
           <wp:inline distT="0" distB="0" distL="0" distR="0" wp14:anchorId="7E21D2BC" wp14:editId="41EC8C57">
             <wp:extent cx="6570980" cy="1880235"/>
@@ -405,6 +438,195 @@
                     <a:xfrm>
                       <a:off x="0" y="0"/>
                       <a:ext cx="6570980" cy="1880235"/>
+                    </a:xfrm>
+                    <a:prstGeom prst="rect">
+                      <a:avLst/>
+                    </a:prstGeom>
+                  </pic:spPr>
+                </pic:pic>
+              </a:graphicData>
+            </a:graphic>
+          </wp:inline>
+        </w:drawing>
+      </w:r>
+    </w:p>
+    <w:p>
+      <w:r>
+        <w:lastRenderedPageBreak/>
+        <w:drawing>
+          <wp:inline distT="0" distB="0" distL="0" distR="0" wp14:anchorId="359828A1" wp14:editId="205CD6C7">
+            <wp:extent cx="6570980" cy="3053080"/>
+            <wp:effectExtent l="0" t="0" r="1270" b="0"/>
+            <wp:docPr id="556048794" name="Imagen 1"/>
+            <wp:cNvGraphicFramePr>
+              <a:graphicFrameLocks xmlns:a="http://schemas.openxmlformats.org/drawingml/2006/main" noChangeAspect="1"/>
+            </wp:cNvGraphicFramePr>
+            <a:graphic xmlns:a="http://schemas.openxmlformats.org/drawingml/2006/main">
+              <a:graphicData uri="http://schemas.openxmlformats.org/drawingml/2006/picture">
+                <pic:pic xmlns:pic="http://schemas.openxmlformats.org/drawingml/2006/picture">
+                  <pic:nvPicPr>
+                    <pic:cNvPr id="556048794" name=""/>
+                    <pic:cNvPicPr/>
+                  </pic:nvPicPr>
+                  <pic:blipFill>
+                    <a:blip r:embed="rId15"/>
+                    <a:stretch>
+                      <a:fillRect/>
+                    </a:stretch>
+                  </pic:blipFill>
+                  <pic:spPr>
+                    <a:xfrm>
+                      <a:off x="0" y="0"/>
+                      <a:ext cx="6570980" cy="3053080"/>
+                    </a:xfrm>
+                    <a:prstGeom prst="rect">
+                      <a:avLst/>
+                    </a:prstGeom>
+                  </pic:spPr>
+                </pic:pic>
+              </a:graphicData>
+            </a:graphic>
+          </wp:inline>
+        </w:drawing>
+      </w:r>
+      <w:r>
+        <w:drawing>
+          <wp:inline distT="0" distB="0" distL="0" distR="0" wp14:anchorId="37D868E4" wp14:editId="4E498054">
+            <wp:extent cx="6570980" cy="1923415"/>
+            <wp:effectExtent l="0" t="0" r="1270" b="635"/>
+            <wp:docPr id="435475338" name="Imagen 1"/>
+            <wp:cNvGraphicFramePr>
+              <a:graphicFrameLocks xmlns:a="http://schemas.openxmlformats.org/drawingml/2006/main" noChangeAspect="1"/>
+            </wp:cNvGraphicFramePr>
+            <a:graphic xmlns:a="http://schemas.openxmlformats.org/drawingml/2006/main">
+              <a:graphicData uri="http://schemas.openxmlformats.org/drawingml/2006/picture">
+                <pic:pic xmlns:pic="http://schemas.openxmlformats.org/drawingml/2006/picture">
+                  <pic:nvPicPr>
+                    <pic:cNvPr id="435475338" name=""/>
+                    <pic:cNvPicPr/>
+                  </pic:nvPicPr>
+                  <pic:blipFill>
+                    <a:blip r:embed="rId16"/>
+                    <a:stretch>
+                      <a:fillRect/>
+                    </a:stretch>
+                  </pic:blipFill>
+                  <pic:spPr>
+                    <a:xfrm>
+                      <a:off x="0" y="0"/>
+                      <a:ext cx="6570980" cy="1923415"/>
+                    </a:xfrm>
+                    <a:prstGeom prst="rect">
+                      <a:avLst/>
+                    </a:prstGeom>
+                  </pic:spPr>
+                </pic:pic>
+              </a:graphicData>
+            </a:graphic>
+          </wp:inline>
+        </w:drawing>
+      </w:r>
+      <w:r>
+        <w:drawing>
+          <wp:inline distT="0" distB="0" distL="0" distR="0" wp14:anchorId="512B8655" wp14:editId="6EEBCBA2">
+            <wp:extent cx="6570980" cy="1727835"/>
+            <wp:effectExtent l="0" t="0" r="1270" b="5715"/>
+            <wp:docPr id="343828419" name="Imagen 1"/>
+            <wp:cNvGraphicFramePr>
+              <a:graphicFrameLocks xmlns:a="http://schemas.openxmlformats.org/drawingml/2006/main" noChangeAspect="1"/>
+            </wp:cNvGraphicFramePr>
+            <a:graphic xmlns:a="http://schemas.openxmlformats.org/drawingml/2006/main">
+              <a:graphicData uri="http://schemas.openxmlformats.org/drawingml/2006/picture">
+                <pic:pic xmlns:pic="http://schemas.openxmlformats.org/drawingml/2006/picture">
+                  <pic:nvPicPr>
+                    <pic:cNvPr id="343828419" name=""/>
+                    <pic:cNvPicPr/>
+                  </pic:nvPicPr>
+                  <pic:blipFill>
+                    <a:blip r:embed="rId17"/>
+                    <a:stretch>
+                      <a:fillRect/>
+                    </a:stretch>
+                  </pic:blipFill>
+                  <pic:spPr>
+                    <a:xfrm>
+                      <a:off x="0" y="0"/>
+                      <a:ext cx="6570980" cy="1727835"/>
+                    </a:xfrm>
+                    <a:prstGeom prst="rect">
+                      <a:avLst/>
+                    </a:prstGeom>
+                  </pic:spPr>
+                </pic:pic>
+              </a:graphicData>
+            </a:graphic>
+          </wp:inline>
+        </w:drawing>
+      </w:r>
+      <w:r>
+        <w:lastRenderedPageBreak/>
+        <w:drawing>
+          <wp:inline distT="0" distB="0" distL="0" distR="0" wp14:anchorId="429F91DC" wp14:editId="3CDF007D">
+            <wp:extent cx="6570980" cy="2935605"/>
+            <wp:effectExtent l="0" t="0" r="1270" b="0"/>
+            <wp:docPr id="1513895786" name="Imagen 1"/>
+            <wp:cNvGraphicFramePr>
+              <a:graphicFrameLocks xmlns:a="http://schemas.openxmlformats.org/drawingml/2006/main" noChangeAspect="1"/>
+            </wp:cNvGraphicFramePr>
+            <a:graphic xmlns:a="http://schemas.openxmlformats.org/drawingml/2006/main">
+              <a:graphicData uri="http://schemas.openxmlformats.org/drawingml/2006/picture">
+                <pic:pic xmlns:pic="http://schemas.openxmlformats.org/drawingml/2006/picture">
+                  <pic:nvPicPr>
+                    <pic:cNvPr id="1513895786" name=""/>
+                    <pic:cNvPicPr/>
+                  </pic:nvPicPr>
+                  <pic:blipFill>
+                    <a:blip r:embed="rId18"/>
+                    <a:stretch>
+                      <a:fillRect/>
+                    </a:stretch>
+                  </pic:blipFill>
+                  <pic:spPr>
+                    <a:xfrm>
+                      <a:off x="0" y="0"/>
+                      <a:ext cx="6570980" cy="2935605"/>
+                    </a:xfrm>
+                    <a:prstGeom prst="rect">
+                      <a:avLst/>
+                    </a:prstGeom>
+                  </pic:spPr>
+                </pic:pic>
+              </a:graphicData>
+            </a:graphic>
+          </wp:inline>
+        </w:drawing>
+      </w:r>
+      <w:r>
+        <w:drawing>
+          <wp:inline distT="0" distB="0" distL="0" distR="0" wp14:anchorId="75B1C016" wp14:editId="2672E159">
+            <wp:extent cx="6570980" cy="2204720"/>
+            <wp:effectExtent l="0" t="0" r="1270" b="5080"/>
+            <wp:docPr id="1569676126" name="Imagen 1"/>
+            <wp:cNvGraphicFramePr>
+              <a:graphicFrameLocks xmlns:a="http://schemas.openxmlformats.org/drawingml/2006/main" noChangeAspect="1"/>
+            </wp:cNvGraphicFramePr>
+            <a:graphic xmlns:a="http://schemas.openxmlformats.org/drawingml/2006/main">
+              <a:graphicData uri="http://schemas.openxmlformats.org/drawingml/2006/picture">
+                <pic:pic xmlns:pic="http://schemas.openxmlformats.org/drawingml/2006/picture">
+                  <pic:nvPicPr>
+                    <pic:cNvPr id="1569676126" name=""/>
+                    <pic:cNvPicPr/>
+                  </pic:nvPicPr>
+                  <pic:blipFill>
+                    <a:blip r:embed="rId19"/>
+                    <a:stretch>
+                      <a:fillRect/>
+                    </a:stretch>
+                  </pic:blipFill>
+                  <pic:spPr>
+                    <a:xfrm>
+                      <a:off x="0" y="0"/>
+                      <a:ext cx="6570980" cy="2204720"/>
                     </a:xfrm>
                     <a:prstGeom prst="rect">
                       <a:avLst/>

</xml_diff>